<commit_message>
Resume: Cybersecurity and Privacy Intern @ QpiAI (startup)
</commit_message>
<xml_diff>
--- a/resumes/Resume_Cybersecurity_and_Privacy_Intern_QpiAI__startup_.docx
+++ b/resumes/Resume_Cybersecurity_and_Privacy_Intern_QpiAI__startup_.docx
@@ -4,7 +4,7 @@
   <w:body>
     <w:p>
       <w:pPr>
-        <w:spacing w:after="44"/>
+        <w:spacing w:after="0" w:before="20"/>
         <w:jc w:val="center"/>
       </w:pPr>
       <w:r>
@@ -21,6 +21,7 @@
     </w:p>
     <w:p>
       <w:pPr>
+        <w:spacing w:before="20" w:after="0"/>
         <w:jc w:val="center"/>
       </w:pPr>
       <w:r>
@@ -116,7 +117,7 @@
         <w:pBdr>
           <w:bottom w:val="single" w:sz="6" w:space="1" w:color="000000"/>
         </w:pBdr>
-        <w:spacing w:before="360" w:after="52"/>
+        <w:spacing w:before="113" w:after="0"/>
       </w:pPr>
       <w:r>
         <w:rPr>
@@ -135,7 +136,7 @@
         <w:tabs>
           <w:tab w:val="right" w:pos="10800"/>
         </w:tabs>
-        <w:spacing w:before="62"/>
+        <w:spacing w:before="20" w:after="0"/>
       </w:pPr>
       <w:r>
         <w:rPr>
@@ -168,7 +169,7 @@
     </w:p>
     <w:p>
       <w:pPr>
-        <w:spacing w:before="8"/>
+        <w:spacing w:before="8" w:after="0"/>
       </w:pPr>
       <w:r>
         <w:rPr>
@@ -187,7 +188,7 @@
         <w:tabs>
           <w:tab w:val="right" w:pos="10800"/>
         </w:tabs>
-        <w:spacing w:before="62"/>
+        <w:spacing w:before="20" w:after="0"/>
       </w:pPr>
       <w:r>
         <w:rPr>
@@ -220,7 +221,7 @@
     </w:p>
     <w:p>
       <w:pPr>
-        <w:spacing w:before="8"/>
+        <w:spacing w:before="8" w:after="0"/>
       </w:pPr>
       <w:r>
         <w:rPr>
@@ -239,7 +240,7 @@
         <w:tabs>
           <w:tab w:val="right" w:pos="10800"/>
         </w:tabs>
-        <w:spacing w:before="62"/>
+        <w:spacing w:before="20" w:after="0"/>
       </w:pPr>
       <w:r>
         <w:rPr>
@@ -272,7 +273,7 @@
     </w:p>
     <w:p>
       <w:pPr>
-        <w:spacing w:before="8"/>
+        <w:spacing w:before="8" w:after="0"/>
       </w:pPr>
       <w:r>
         <w:rPr>
@@ -288,7 +289,7 @@
     </w:p>
     <w:p>
       <w:pPr>
-        <w:spacing w:before="8"/>
+        <w:spacing w:before="23" w:after="23"/>
       </w:pPr>
     </w:p>
     <w:p>
@@ -296,7 +297,7 @@
         <w:pBdr>
           <w:bottom w:val="single" w:sz="6" w:space="1" w:color="000000"/>
         </w:pBdr>
-        <w:spacing w:before="155" w:after="52"/>
+        <w:spacing w:before="113" w:after="0"/>
       </w:pPr>
       <w:r>
         <w:rPr>
@@ -315,7 +316,7 @@
         <w:tabs>
           <w:tab w:val="right" w:pos="10800"/>
         </w:tabs>
-        <w:spacing w:before="62"/>
+        <w:spacing w:before="20" w:after="0"/>
       </w:pPr>
       <w:r>
         <w:rPr>
@@ -359,7 +360,7 @@
         <w:tabs>
           <w:tab w:val="right" w:pos="10800"/>
         </w:tabs>
-        <w:spacing w:before="8"/>
+        <w:spacing w:before="8" w:after="0"/>
       </w:pPr>
       <w:r>
         <w:rPr>
@@ -403,34 +404,16 @@
           <w:ilvl w:val="0"/>
           <w:numId w:val="2"/>
         </w:numPr>
-        <w:spacing w:before="13" w:after="13"/>
-      </w:pPr>
-      <w:r>
-        <w:rPr>
-          <w:rFonts w:ascii="Source Sans Pro" w:eastAsia="Source Sans Pro" w:hAnsi="Source Sans Pro" w:cs="Source Sans Pro"/>
-          <w:color w:val="000000"/>
-          <w:sz w:val="19"/>
-          <w:szCs w:val="19"/>
-        </w:rPr>
-        <w:t>Triaged 50+ weekly inventory reimbursement cases by severity and policy eligibility, mirroring SOC Tier 1 analyst workflow.</w:t>
-      </w:r>
-      <w:proofErr w:type="spellStart"/>
-      <w:r>
-        <w:rPr>
-          <w:rFonts w:ascii="Source Sans Pro" w:eastAsia="Source Sans Pro" w:hAnsi="Source Sans Pro" w:cs="Source Sans Pro"/>
-          <w:color w:val="000000"/>
-          <w:sz w:val="19"/>
-          <w:szCs w:val="19"/>
-        </w:rPr>
-      </w:r>
-      <w:proofErr w:type="spellEnd"/>
-      <w:r>
-        <w:rPr>
-          <w:rFonts w:ascii="Source Sans Pro" w:eastAsia="Source Sans Pro" w:hAnsi="Source Sans Pro" w:cs="Source Sans Pro"/>
-          <w:color w:val="000000"/>
-          <w:sz w:val="19"/>
-          <w:szCs w:val="19"/>
-        </w:rPr>
+        <w:spacing w:before="13" w:after="32"/>
+      </w:pPr>
+      <w:r>
+        <w:rPr>
+          <w:rFonts w:ascii="Source Sans Pro" w:eastAsia="Source Sans Pro" w:hAnsi="Source Sans Pro" w:cs="Source Sans Pro"/>
+          <w:color w:val="000000"/>
+          <w:sz w:val="19"/>
+          <w:szCs w:val="19"/>
+        </w:rPr>
+        <w:t>Triaged 50+ weekly inventory reimbursement cases by severity and policy eligibility, translating high-volume case review into structured investigation, escalation, and evidence documentation.</w:t>
       </w:r>
     </w:p>
     <w:p>
@@ -440,16 +423,16 @@
           <w:ilvl w:val="0"/>
           <w:numId w:val="2"/>
         </w:numPr>
-        <w:spacing w:before="13" w:after="13"/>
-      </w:pPr>
-      <w:r>
-        <w:rPr>
-          <w:rFonts w:ascii="Source Sans Pro" w:eastAsia="Source Sans Pro" w:hAnsi="Source Sans Pro" w:cs="Source Sans Pro"/>
-          <w:color w:val="000000"/>
-          <w:sz w:val="19"/>
-          <w:szCs w:val="19"/>
-        </w:rPr>
-        <w:t>Performed root cause analysis on seller claims to identify policy violations and anomalous patterns; escalated findings to senior reviewers.</w:t>
+        <w:spacing w:before="13" w:after="32"/>
+      </w:pPr>
+      <w:r>
+        <w:rPr>
+          <w:rFonts w:ascii="Source Sans Pro" w:eastAsia="Source Sans Pro" w:hAnsi="Source Sans Pro" w:cs="Source Sans Pro"/>
+          <w:color w:val="000000"/>
+          <w:sz w:val="19"/>
+          <w:szCs w:val="19"/>
+        </w:rPr>
+        <w:t>Conducted root cause analysis on seller claims, identifying policy violations and anomalous patterns for pattern review and investigation handoffs.</w:t>
       </w:r>
     </w:p>
     <w:p>
@@ -459,91 +442,16 @@
           <w:ilvl w:val="0"/>
           <w:numId w:val="2"/>
         </w:numPr>
-        <w:spacing w:before="13" w:after="13"/>
-      </w:pPr>
-      <w:r>
-        <w:rPr>
-          <w:rFonts w:ascii="Source Sans Pro" w:eastAsia="Source Sans Pro" w:hAnsi="Source Sans Pro" w:cs="Source Sans Pro"/>
-          <w:color w:val="000000"/>
-          <w:sz w:val="19"/>
-          <w:szCs w:val="19"/>
-        </w:rPr>
-        <w:t>Maintained audit-ready case documentation recording investigation findings, decisions, and corrective actions for security incident reporting.</w:t>
-      </w:r>
-    </w:p>
-    <w:p>
-      <w:pPr>
-        <w:pBdr>
-          <w:bottom w:val="single" w:sz="6" w:space="1" w:color="000000"/>
-        </w:pBdr>
-        <w:spacing w:before="155" w:after="52"/>
-        <w:rPr>
-          <w:rFonts w:ascii="Source Sans Pro" w:eastAsia="Source Sans Pro" w:hAnsi="Source Sans Pro" w:cs="Source Sans Pro"/>
-          <w:b/>
-          <w:bCs/>
-          <w:color w:val="000000"/>
-          <w:sz w:val="22"/>
-          <w:szCs w:val="22"/>
-        </w:rPr>
-      </w:pPr>
-    </w:p>
-    <w:p>
-      <w:pPr>
-        <w:pBdr>
-          <w:bottom w:val="single" w:sz="6" w:space="1" w:color="000000"/>
-        </w:pBdr>
-        <w:spacing w:before="155" w:after="52"/>
-      </w:pPr>
-      <w:r>
-        <w:rPr>
-          <w:rFonts w:ascii="Source Sans Pro" w:eastAsia="Source Sans Pro" w:hAnsi="Source Sans Pro" w:cs="Source Sans Pro"/>
-          <w:b/>
-          <w:bCs/>
-          <w:color w:val="000000"/>
-          <w:sz w:val="22"/>
-          <w:szCs w:val="22"/>
-        </w:rPr>
-        <w:t>Projects</w:t>
-      </w:r>
-    </w:p>
-    <w:p>
-      <w:pPr>
-        <w:tabs>
-          <w:tab w:val="right" w:pos="10800"/>
-        </w:tabs>
-        <w:spacing w:before="62"/>
-      </w:pPr>
-      <w:proofErr w:type="spellStart"/>
-      <w:proofErr w:type="spellEnd"/>
-      <w:hyperlink r:id="rId13">
-        <w:r>
-          <w:rPr>
-            <w:rFonts w:ascii="Source Sans Pro" w:eastAsia="Source Sans Pro" w:hAnsi="Source Sans Pro" w:cs="Source Sans Pro"/>
-            <w:b/>
-            <w:sz w:val="19"/>
-            <w:szCs w:val="19"/>
-            <w:color w:val="000000"/>
-            <w:u w:val="single"/>
-          </w:rPr>
-          <w:t>SOC Automation &amp; Threat Detection Lab</w:t>
-        </w:r>
-      </w:hyperlink>
-      <w:r>
-        <w:rPr>
-          <w:rFonts w:ascii="Source Sans Pro" w:eastAsia="Source Sans Pro" w:hAnsi="Source Sans Pro" w:cs="Source Sans Pro"/>
-          <w:sz w:val="19"/>
-          <w:szCs w:val="19"/>
-        </w:rPr>
-        <w:t xml:space="preserve">  |  	</w:t>
-      </w:r>
-      <w:r>
-        <w:rPr>
-          <w:rFonts w:ascii="Source Sans Pro" w:eastAsia="Source Sans Pro" w:hAnsi="Source Sans Pro" w:cs="Source Sans Pro"/>
-          <w:i/>
-          <w:sz w:val="19"/>
-          <w:szCs w:val="19"/>
-        </w:rPr>
-        <w:t>Python, Splunk, Wireshark, Nmap, MITRE ATT&amp;CK</w:t>
+        <w:spacing w:before="13" w:after="32"/>
+      </w:pPr>
+      <w:r>
+        <w:rPr>
+          <w:rFonts w:ascii="Source Sans Pro" w:eastAsia="Source Sans Pro" w:hAnsi="Source Sans Pro" w:cs="Source Sans Pro"/>
+          <w:color w:val="000000"/>
+          <w:sz w:val="19"/>
+          <w:szCs w:val="19"/>
+        </w:rPr>
+        <w:t>Maintained audit-ready case documentation with findings, decisions, evidence notes, and corrective actions aligned to evidence documentation and decision trails.</w:t>
       </w:r>
     </w:p>
     <w:p>
@@ -553,16 +461,195 @@
           <w:ilvl w:val="0"/>
           <w:numId w:val="2"/>
         </w:numPr>
-        <w:spacing w:before="13" w:after="13"/>
-      </w:pPr>
-      <w:r>
-        <w:rPr>
-          <w:rFonts w:ascii="Source Sans Pro" w:eastAsia="Source Sans Pro" w:hAnsi="Source Sans Pro" w:cs="Source Sans Pro"/>
-          <w:color w:val="000000"/>
-          <w:sz w:val="19"/>
-          <w:szCs w:val="19"/>
-        </w:rPr>
-        <w:t>Deployed Splunk SIEM with SPL correlation searches for brute-force detection, lateral movement, and privilege escalation; mapped TTPs to MITRE ATT&amp;CK.</w:t>
+        <w:spacing w:before="13" w:after="32"/>
+      </w:pPr>
+      <w:r>
+        <w:rPr>
+          <w:rFonts w:ascii="Source Sans Pro" w:eastAsia="Source Sans Pro" w:hAnsi="Source Sans Pro" w:cs="Source Sans Pro"/>
+          <w:color w:val="000000"/>
+          <w:sz w:val="19"/>
+          <w:szCs w:val="19"/>
+        </w:rPr>
+        <w:t>Spotted recurring fraud patterns across 200+ weekly cases and flagged repeat issues early, reducing investigation cycles before escalation.</w:t>
+      </w:r>
+    </w:p>
+    <w:p>
+      <w:pPr>
+        <w:spacing w:before="23" w:after="23"/>
+        <w:rPr>
+          <w:rFonts w:ascii="Source Sans Pro" w:eastAsia="Source Sans Pro" w:hAnsi="Source Sans Pro" w:cs="Source Sans Pro"/>
+          <w:b/>
+          <w:bCs/>
+          <w:color w:val="000000"/>
+          <w:sz w:val="22"/>
+          <w:szCs w:val="22"/>
+        </w:rPr>
+      </w:pPr>
+    </w:p>
+    <w:p>
+      <w:pPr>
+        <w:spacing w:before="106" w:after="0"/>
+        <w:rPr>
+          <w:rFonts w:ascii="Source Sans Pro" w:eastAsia="Source Sans Pro" w:hAnsi="Source Sans Pro" w:cs="Source Sans Pro"/>
+          <w:b/>
+          <w:bCs/>
+          <w:color w:val="000000"/>
+          <w:sz w:val="22"/>
+          <w:szCs w:val="22"/>
+        </w:rPr>
+      </w:pPr>
+      <w:r>
+        <w:rPr>
+          <w:rFonts w:ascii="SF Pro" w:hAnsi="SF Pro"/>
+          <w:noProof/>
+        </w:rPr>
+        <mc:AlternateContent>
+          <mc:Choice Requires="wps">
+            <w:drawing>
+              <wp:anchor distT="0" distB="0" distL="114300" distR="114300" simplePos="0" relativeHeight="251659264" behindDoc="0" locked="0" layoutInCell="1" allowOverlap="1" wp14:anchorId="491819C8" wp14:editId="6BC13A2A">
+                <wp:simplePos x="0" y="0"/>
+                <wp:positionH relativeFrom="column">
+                  <wp:posOffset>0</wp:posOffset>
+                </wp:positionH>
+                <wp:positionV relativeFrom="paragraph">
+                  <wp:posOffset>193463</wp:posOffset>
+                </wp:positionV>
+                <wp:extent cx="6896478" cy="0"/>
+                <wp:effectExtent l="0" t="0" r="12700" b="12700"/>
+                <wp:wrapNone/>
+                <wp:docPr id="2078198358" name="Straight Connector 16"/>
+                <wp:cNvGraphicFramePr/>
+                <a:graphic xmlns:a="http://schemas.openxmlformats.org/drawingml/2006/main">
+                  <a:graphicData uri="http://schemas.microsoft.com/office/word/2010/wordprocessingShape">
+                    <wps:wsp>
+                      <wps:cNvCnPr/>
+                      <wps:spPr>
+                        <a:xfrm>
+                          <a:off x="0" y="0"/>
+                          <a:ext cx="6896478" cy="0"/>
+                        </a:xfrm>
+                        <a:prstGeom prst="line">
+                          <a:avLst/>
+                        </a:prstGeom>
+                        <a:ln>
+                          <a:solidFill>
+                            <a:schemeClr val="bg1">
+                              <a:lumMod val="85000"/>
+                            </a:schemeClr>
+                          </a:solidFill>
+                        </a:ln>
+                      </wps:spPr>
+                      <wps:style>
+                        <a:lnRef idx="1">
+                          <a:schemeClr val="dk1"/>
+                        </a:lnRef>
+                        <a:fillRef idx="0">
+                          <a:schemeClr val="dk1"/>
+                        </a:fillRef>
+                        <a:effectRef idx="0">
+                          <a:schemeClr val="dk1"/>
+                        </a:effectRef>
+                        <a:fontRef idx="minor">
+                          <a:schemeClr val="tx1"/>
+                        </a:fontRef>
+                      </wps:style>
+                      <wps:bodyPr/>
+                    </wps:wsp>
+                  </a:graphicData>
+                </a:graphic>
+                <wp14:sizeRelH relativeFrom="margin">
+                  <wp14:pctWidth>0</wp14:pctWidth>
+                </wp14:sizeRelH>
+              </wp:anchor>
+            </w:drawing>
+          </mc:Choice>
+          <mc:Fallback>
+            <w:pict>
+              <v:line w14:anchorId="7543AEE3" id="Straight Connector 16" o:spid="_x0000_s1026" style="position:absolute;z-index:251659264;visibility:visible;mso-wrap-style:square;mso-width-percent:0;mso-wrap-distance-left:9pt;mso-wrap-distance-top:0;mso-wrap-distance-right:9pt;mso-wrap-distance-bottom:0;mso-position-horizontal:absolute;mso-position-horizontal-relative:text;mso-position-vertical:absolute;mso-position-vertical-relative:text;mso-width-percent:0;mso-width-relative:margin" from="0,15.25pt" to="543.05pt,15.25pt" o:gfxdata="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" strokecolor="#d8d8d8 [2732]" strokeweight="1pt">
+                <v:stroke joinstyle="miter"/>
+              </v:line>
+            </w:pict>
+          </mc:Fallback>
+        </mc:AlternateContent>
+      </w:r>
+      <w:r>
+        <w:rPr>
+          <w:rFonts w:ascii="Source Sans Pro" w:eastAsia="Source Sans Pro" w:hAnsi="Source Sans Pro" w:cs="Source Sans Pro"/>
+          <w:b/>
+          <w:bCs/>
+          <w:color w:val="000000"/>
+          <w:sz w:val="22"/>
+          <w:szCs w:val="22"/>
+        </w:rPr>
+        <w:t>Projects</w:t>
+      </w:r>
+    </w:p>
+    <w:p>
+      <w:pPr>
+        <w:tabs>
+          <w:tab w:val="right" w:pos="10800"/>
+        </w:tabs>
+        <w:spacing w:before="20" w:after="0"/>
+      </w:pPr>
+      <w:hyperlink r:id="rId8">
+        <w:r>
+          <w:rPr>
+            <w:rFonts w:ascii="Source Sans Pro" w:eastAsia="Source Sans Pro" w:hAnsi="Source Sans Pro" w:cs="Source Sans Pro"/>
+            <w:b/>
+            <w:color w:val="000000"/>
+            <w:sz w:val="19"/>
+            <w:szCs w:val="19"/>
+            <w:u w:val="single"/>
+          </w:rPr>
+          <w:t>SOC Automation and Threat Detection Lab  |  Python, Splunk, Wireshark, Nmap, MITRE ATT&amp;CK</w:t>
+        </w:r>
+        <w:r>
+          <w:rPr>
+            <w:rFonts w:ascii="Source Sans Pro" w:eastAsia="Source Sans Pro" w:hAnsi="Source Sans Pro" w:cs="Source Sans Pro"/>
+            <w:b/>
+            <w:color w:val="000000"/>
+            <w:sz w:val="19"/>
+            <w:szCs w:val="19"/>
+            <w:u w:val="single"/>
+          </w:rPr>
+          <w:t/>
+        </w:r>
+        <w:r>
+          <w:rPr>
+            <w:rFonts w:ascii="Source Sans Pro" w:eastAsia="Source Sans Pro" w:hAnsi="Source Sans Pro" w:cs="Source Sans Pro"/>
+            <w:b/>
+            <w:color w:val="000000"/>
+            <w:sz w:val="19"/>
+            <w:szCs w:val="19"/>
+            <w:u w:val="single"/>
+          </w:rPr>
+          <w:t/>
+        </w:r>
+      </w:hyperlink>
+      <w:r>
+        <w:rPr>
+          <w:rFonts w:ascii="Source Sans Pro" w:eastAsia="Source Sans Pro" w:hAnsi="Source Sans Pro" w:cs="Source Sans Pro"/>
+          <w:sz w:val="19"/>
+          <w:szCs w:val="19"/>
+        </w:rPr>
+        <w:t xml:space="preserve"/>
+      </w:r>
+      <w:r>
+        <w:rPr>
+          <w:rFonts w:ascii="Source Sans Pro" w:eastAsia="Source Sans Pro" w:hAnsi="Source Sans Pro" w:cs="Source Sans Pro"/>
+          <w:sz w:val="19"/>
+          <w:szCs w:val="19"/>
+        </w:rPr>
+        <w:tab/>
+      </w:r>
+      <w:r>
+        <w:rPr>
+          <w:rFonts w:ascii="Source Sans Pro" w:eastAsia="Source Sans Pro" w:hAnsi="Source Sans Pro" w:cs="Source Sans Pro"/>
+          <w:i/>
+          <w:sz w:val="19"/>
+          <w:szCs w:val="19"/>
+        </w:rPr>
+        <w:t/>
       </w:r>
     </w:p>
     <w:p>
@@ -572,16 +659,16 @@
           <w:ilvl w:val="0"/>
           <w:numId w:val="2"/>
         </w:numPr>
-        <w:spacing w:before="13" w:after="13"/>
-      </w:pPr>
-      <w:r>
-        <w:rPr>
-          <w:rFonts w:ascii="Source Sans Pro" w:eastAsia="Source Sans Pro" w:hAnsi="Source Sans Pro" w:cs="Source Sans Pro"/>
-          <w:color w:val="000000"/>
-          <w:sz w:val="19"/>
-          <w:szCs w:val="19"/>
-        </w:rPr>
-        <w:t>Built automated SOAR-style detection pipeline: Python script ingests Splunk alerts, runs IOC enrichment via VirusTotal API, and dispatches Telegram notifications.</w:t>
+        <w:spacing w:before="13" w:after="32"/>
+      </w:pPr>
+      <w:r>
+        <w:rPr>
+          <w:rFonts w:ascii="Source Sans Pro" w:eastAsia="Source Sans Pro" w:hAnsi="Source Sans Pro" w:cs="Source Sans Pro"/>
+          <w:color w:val="000000"/>
+          <w:sz w:val="19"/>
+          <w:szCs w:val="19"/>
+        </w:rPr>
+        <w:t>Deployed Splunk SIEM with SPL correlation searches for brute-force detection, lateral movement, and privilege escalation; mapped TTPs to MITRE ATT&amp;CK and wrote PICERL incident report.</w:t>
       </w:r>
     </w:p>
     <w:p>
@@ -591,95 +678,16 @@
           <w:ilvl w:val="0"/>
           <w:numId w:val="2"/>
         </w:numPr>
-        <w:spacing w:before="13" w:after="13"/>
-      </w:pPr>
-      <w:r>
-        <w:rPr>
-          <w:rFonts w:ascii="Source Sans Pro" w:eastAsia="Source Sans Pro" w:hAnsi="Source Sans Pro" w:cs="Source Sans Pro"/>
-          <w:color w:val="000000"/>
-          <w:sz w:val="19"/>
-          <w:szCs w:val="19"/>
-        </w:rPr>
-        <w:t>Converted detection logic to Sigma rules; performed TCP/IP analysis in Wireshark to detect SYN scans, DNS tunnelling, and plaintext credential exposure.</w:t>
-      </w:r>
-      <w:proofErr w:type="spellStart"/>
-      <w:r>
-        <w:rPr>
-          <w:rFonts w:ascii="Source Sans Pro" w:eastAsia="Source Sans Pro" w:hAnsi="Source Sans Pro" w:cs="Source Sans Pro"/>
-          <w:color w:val="000000"/>
-          <w:sz w:val="19"/>
-          <w:szCs w:val="19"/>
-        </w:rPr>
-      </w:r>
-      <w:proofErr w:type="spellEnd"/>
-      <w:r>
-        <w:rPr>
-          <w:rFonts w:ascii="Source Sans Pro" w:eastAsia="Source Sans Pro" w:hAnsi="Source Sans Pro" w:cs="Source Sans Pro"/>
-          <w:color w:val="000000"/>
-          <w:sz w:val="19"/>
-          <w:szCs w:val="19"/>
-        </w:rPr>
-      </w:r>
-      <w:proofErr w:type="spellStart"/>
-      <w:r>
-        <w:rPr>
-          <w:rFonts w:ascii="Source Sans Pro" w:eastAsia="Source Sans Pro" w:hAnsi="Source Sans Pro" w:cs="Source Sans Pro"/>
-          <w:color w:val="000000"/>
-          <w:sz w:val="19"/>
-          <w:szCs w:val="19"/>
-        </w:rPr>
-      </w:r>
-      <w:proofErr w:type="spellEnd"/>
-      <w:r>
-        <w:rPr>
-          <w:rFonts w:ascii="Source Sans Pro" w:eastAsia="Source Sans Pro" w:hAnsi="Source Sans Pro" w:cs="Source Sans Pro"/>
-          <w:color w:val="000000"/>
-          <w:sz w:val="19"/>
-          <w:szCs w:val="19"/>
-        </w:rPr>
-      </w:r>
-    </w:p>
-    <w:p>
-      <w:pPr>
-        <w:spacing w:before="30"/>
-      </w:pPr>
-    </w:p>
-    <w:p>
-      <w:pPr>
-        <w:tabs>
-          <w:tab w:val="right" w:pos="10800"/>
-        </w:tabs>
-        <w:spacing w:before="30"/>
-      </w:pPr>
-      <w:hyperlink r:id="rId14">
-        <w:r>
-          <w:rPr>
-            <w:rFonts w:ascii="Source Sans Pro" w:eastAsia="Source Sans Pro" w:hAnsi="Source Sans Pro" w:cs="Source Sans Pro"/>
-            <w:b/>
-            <w:sz w:val="19"/>
-            <w:szCs w:val="19"/>
-            <w:color w:val="000000"/>
-            <w:u w:val="single"/>
-          </w:rPr>
-          <w:t>Vulnerability Scanner &amp; Patch Prioritization Engine</w:t>
-        </w:r>
-      </w:hyperlink>
-      <w:r>
-        <w:rPr>
-          <w:rFonts w:ascii="Source Sans Pro" w:eastAsia="Source Sans Pro" w:hAnsi="Source Sans Pro" w:cs="Source Sans Pro"/>
-          <w:sz w:val="19"/>
-          <w:szCs w:val="19"/>
-        </w:rPr>
-        <w:t xml:space="preserve">  |  	</w:t>
-      </w:r>
-      <w:r>
-        <w:rPr>
-          <w:rFonts w:ascii="Source Sans Pro" w:eastAsia="Source Sans Pro" w:hAnsi="Source Sans Pro" w:cs="Source Sans Pro"/>
-          <w:i/>
-          <w:sz w:val="19"/>
-          <w:szCs w:val="19"/>
-        </w:rPr>
-        <w:t>Python, Bash, Nessus, OpenVAS, NVD API</w:t>
+        <w:spacing w:before="13" w:after="32"/>
+      </w:pPr>
+      <w:r>
+        <w:rPr>
+          <w:rFonts w:ascii="Source Sans Pro" w:eastAsia="Source Sans Pro" w:hAnsi="Source Sans Pro" w:cs="Source Sans Pro"/>
+          <w:color w:val="000000"/>
+          <w:sz w:val="19"/>
+          <w:szCs w:val="19"/>
+        </w:rPr>
+        <w:t>Developed SOAR-style detection pipeline using Python, ingesting Splunk alerts, enriching with VirusTotal API, and dispatching Telegram notifications with severity classification.</w:t>
       </w:r>
     </w:p>
     <w:p>
@@ -689,16 +697,67 @@
           <w:ilvl w:val="0"/>
           <w:numId w:val="2"/>
         </w:numPr>
-        <w:spacing w:before="13" w:after="13"/>
-      </w:pPr>
-      <w:r>
-        <w:rPr>
-          <w:rFonts w:ascii="Source Sans Pro" w:eastAsia="Source Sans Pro" w:hAnsi="Source Sans Pro" w:cs="Source Sans Pro"/>
-          <w:color w:val="000000"/>
-          <w:sz w:val="19"/>
-          <w:szCs w:val="19"/>
-        </w:rPr>
-        <w:t>Built automated vulnerability assessment pipeline integrating Nessus and OpenVAS REST APIs in Python; generates CVE reports classified by CVSS severity.</w:t>
+        <w:spacing w:before="13" w:after="32"/>
+      </w:pPr>
+      <w:r>
+        <w:rPr>
+          <w:rFonts w:ascii="Source Sans Pro" w:eastAsia="Source Sans Pro" w:hAnsi="Source Sans Pro" w:cs="Source Sans Pro"/>
+          <w:color w:val="000000"/>
+          <w:sz w:val="19"/>
+          <w:szCs w:val="19"/>
+        </w:rPr>
+        <w:t>Converted detection logic to Sigma rules; analyzed TCP/IP traffic in Wireshark for SYN scans, DNS tunnelling, and plaintext credential exposure.</w:t>
+      </w:r>
+    </w:p>
+    <w:p>
+      <w:pPr>
+        <w:spacing w:before="23" w:after="23"/>
+      </w:pPr>
+    </w:p>
+    <w:p>
+      <w:pPr>
+        <w:tabs>
+          <w:tab w:val="right" w:pos="10800"/>
+        </w:tabs>
+        <w:spacing w:before="30" w:after="0"/>
+      </w:pPr>
+      <w:hyperlink r:id="rId9">
+        <w:r>
+          <w:rPr>
+            <w:rFonts w:ascii="Source Sans Pro" w:eastAsia="Source Sans Pro" w:hAnsi="Source Sans Pro" w:cs="Source Sans Pro"/>
+            <w:b/>
+            <w:color w:val="000000"/>
+            <w:sz w:val="19"/>
+            <w:szCs w:val="19"/>
+            <w:u w:val="single"/>
+          </w:rPr>
+          <w:t>Vulnerability Scanner and Patch Prioritization Engine</w:t>
+        </w:r>
+      </w:hyperlink>
+      <w:r>
+        <w:rPr>
+          <w:rFonts w:ascii="Source Sans Pro" w:eastAsia="Source Sans Pro" w:hAnsi="Source Sans Pro" w:cs="Source Sans Pro"/>
+          <w:sz w:val="19"/>
+          <w:szCs w:val="19"/>
+        </w:rPr>
+        <w:t xml:space="preserve">  |  </w:t>
+      </w:r>
+      <w:r>
+        <w:rPr>
+          <w:rFonts w:ascii="Source Sans Pro" w:eastAsia="Source Sans Pro" w:hAnsi="Source Sans Pro" w:cs="Source Sans Pro"/>
+          <w:sz w:val="19"/>
+          <w:szCs w:val="19"/>
+        </w:rPr>
+        <w:tab/>
+      </w:r>
+      <w:r>
+        <w:rPr>
+          <w:rFonts w:ascii="Source Sans Pro" w:eastAsia="Source Sans Pro" w:hAnsi="Source Sans Pro" w:cs="Source Sans Pro"/>
+          <w:i/>
+          <w:sz w:val="19"/>
+          <w:szCs w:val="19"/>
+        </w:rPr>
+        <w:t>Python, Bash, Nessus, OpenVAS, NVD API</w:t>
       </w:r>
     </w:p>
     <w:p>
@@ -708,16 +767,16 @@
           <w:ilvl w:val="0"/>
           <w:numId w:val="2"/>
         </w:numPr>
-        <w:spacing w:before="13" w:after="13"/>
-      </w:pPr>
-      <w:r>
-        <w:rPr>
-          <w:rFonts w:ascii="Source Sans Pro" w:eastAsia="Source Sans Pro" w:hAnsi="Source Sans Pro" w:cs="Source Sans Pro"/>
-          <w:color w:val="000000"/>
-          <w:sz w:val="19"/>
-          <w:szCs w:val="19"/>
-        </w:rPr>
-        <w:t>Developed OWASP Top 10 automated web checker that sends crafted HTTP requests to test targets and detects injection, broken auth, and SSRF vulnerabilities.</w:t>
+        <w:spacing w:before="13" w:after="32"/>
+      </w:pPr>
+      <w:r>
+        <w:rPr>
+          <w:rFonts w:ascii="Source Sans Pro" w:eastAsia="Source Sans Pro" w:hAnsi="Source Sans Pro" w:cs="Source Sans Pro"/>
+          <w:color w:val="000000"/>
+          <w:sz w:val="19"/>
+          <w:szCs w:val="19"/>
+        </w:rPr>
+        <w:t>Developed automated vulnerability assessment pipeline integrating Nessus and OpenVAS REST APIs in Python, generating CVE reports with CVSS severity and EPSS context from FIRST.org API.</w:t>
       </w:r>
     </w:p>
     <w:p>
@@ -727,196 +786,16 @@
           <w:ilvl w:val="0"/>
           <w:numId w:val="2"/>
         </w:numPr>
-        <w:spacing w:before="13" w:after="13"/>
-      </w:pPr>
-      <w:r>
-        <w:rPr>
-          <w:rFonts w:ascii="Source Sans Pro" w:eastAsia="Source Sans Pro" w:hAnsi="Source Sans Pro" w:cs="Source Sans Pro"/>
-          <w:color w:val="000000"/>
-          <w:sz w:val="19"/>
-          <w:szCs w:val="19"/>
-        </w:rPr>
-        <w:t>Automated scan scheduling via Bash and cron; built delta-scan logic comparing consecutive runs to flag newly discovered CVEs and calculate remediation SLA deadlines.</w:t>
-      </w:r>
-    </w:p>
-    <w:p>
-      <w:pPr>
-        <w:pBdr>
-          <w:bottom w:val="single" w:sz="6" w:space="1" w:color="000000"/>
-        </w:pBdr>
-        <w:spacing w:before="155" w:after="52"/>
-        <w:rPr>
-          <w:rFonts w:ascii="Source Sans Pro" w:eastAsia="Source Sans Pro" w:hAnsi="Source Sans Pro" w:cs="Source Sans Pro"/>
-          <w:b/>
-          <w:bCs/>
-          <w:color w:val="000000"/>
-          <w:sz w:val="22"/>
-          <w:szCs w:val="22"/>
-        </w:rPr>
-      </w:pPr>
-    </w:p>
-    <w:p>
-      <w:pPr>
-        <w:pBdr>
-          <w:bottom w:val="single" w:sz="6" w:space="1" w:color="000000"/>
-        </w:pBdr>
-        <w:spacing w:before="155" w:after="52"/>
-      </w:pPr>
-      <w:r>
-        <w:rPr>
-          <w:rFonts w:ascii="Source Sans Pro" w:eastAsia="Source Sans Pro" w:hAnsi="Source Sans Pro" w:cs="Source Sans Pro"/>
-          <w:b/>
-          <w:bCs/>
-          <w:color w:val="000000"/>
-          <w:sz w:val="22"/>
-          <w:szCs w:val="22"/>
-        </w:rPr>
-        <w:t>Technical Skills</w:t>
-      </w:r>
-    </w:p>
-    <w:p>
-      <w:pPr>
-        <w:spacing w:before="24" w:after="24"/>
-      </w:pPr>
-      <w:r>
-        <w:rPr>
-          <w:rFonts w:ascii="Source Sans Pro" w:eastAsia="Source Sans Pro" w:hAnsi="Source Sans Pro" w:cs="Source Sans Pro"/>
-          <w:b/>
-          <w:sz w:val="19"/>
-          <w:szCs w:val="19"/>
-        </w:rPr>
-        <w:t xml:space="preserve">SOC Operations: </w:t>
-      </w:r>
-      <w:r>
-        <w:rPr>
-          <w:rFonts w:ascii="Source Sans Pro" w:eastAsia="Source Sans Pro" w:hAnsi="Source Sans Pro" w:cs="Source Sans Pro"/>
-          <w:sz w:val="19"/>
-          <w:szCs w:val="19"/>
-        </w:rPr>
-        <w:t>Alert triage, incident investigation, log analysis, threat detection, escalation, false positive analysis</w:t>
-      </w:r>
-    </w:p>
-    <w:p>
-      <w:pPr>
-        <w:spacing w:before="24" w:after="24"/>
-      </w:pPr>
-      <w:r>
-        <w:rPr>
-          <w:rFonts w:ascii="Source Sans Pro" w:eastAsia="Source Sans Pro" w:hAnsi="Source Sans Pro" w:cs="Source Sans Pro"/>
-          <w:b/>
-          <w:sz w:val="19"/>
-          <w:szCs w:val="19"/>
-        </w:rPr>
-        <w:t xml:space="preserve">SIEM &amp; Monitoring: </w:t>
-      </w:r>
-      <w:r>
-        <w:rPr>
-          <w:rFonts w:ascii="Source Sans Pro" w:eastAsia="Source Sans Pro" w:hAnsi="Source Sans Pro" w:cs="Source Sans Pro"/>
-          <w:sz w:val="19"/>
-          <w:szCs w:val="19"/>
-        </w:rPr>
-        <w:t>Splunk (SPL), Elastic SIEM (basic), Windows Event Logs, Sysmon, Wireshark</w:t>
-      </w:r>
-    </w:p>
-    <w:p>
-      <w:pPr>
-        <w:spacing w:before="24" w:after="24"/>
-      </w:pPr>
-      <w:r>
-        <w:rPr>
-          <w:rFonts w:ascii="Source Sans Pro" w:eastAsia="Source Sans Pro" w:hAnsi="Source Sans Pro" w:cs="Source Sans Pro"/>
-          <w:b/>
-          <w:sz w:val="19"/>
-          <w:szCs w:val="19"/>
-        </w:rPr>
-        <w:t xml:space="preserve">Threat Intelligence: </w:t>
-      </w:r>
-      <w:r>
-        <w:rPr>
-          <w:rFonts w:ascii="Source Sans Pro" w:eastAsia="Source Sans Pro" w:hAnsi="Source Sans Pro" w:cs="Source Sans Pro"/>
-          <w:sz w:val="19"/>
-          <w:szCs w:val="19"/>
-        </w:rPr>
-        <w:t>MITRE ATT&amp;CK, IOC analysis, VirusTotal, OSINT enrichment, Cyber Kill Chain</w:t>
-      </w:r>
-    </w:p>
-    <w:p>
-      <w:pPr>
-        <w:spacing w:before="24" w:after="24"/>
-      </w:pPr>
-      <w:r>
-        <w:rPr>
-          <w:rFonts w:ascii="Source Sans Pro" w:eastAsia="Source Sans Pro" w:hAnsi="Source Sans Pro" w:cs="Source Sans Pro"/>
-          <w:b/>
-          <w:sz w:val="19"/>
-          <w:szCs w:val="19"/>
-        </w:rPr>
-        <w:t xml:space="preserve">Systems &amp; Networking: </w:t>
-      </w:r>
-      <w:r>
-        <w:rPr>
-          <w:rFonts w:ascii="Source Sans Pro" w:eastAsia="Source Sans Pro" w:hAnsi="Source Sans Pro" w:cs="Source Sans Pro"/>
-          <w:sz w:val="19"/>
-          <w:szCs w:val="19"/>
-        </w:rPr>
-        <w:t>Windows internals, Linux fundamentals, TCP/IP, DNS, HTTP/S, firewall and IDS/IPS concepts</w:t>
-      </w:r>
-    </w:p>
-    <w:p>
-      <w:pPr>
-        <w:spacing w:before="24" w:after="24"/>
-      </w:pPr>
-      <w:r>
-        <w:rPr>
-          <w:rFonts w:ascii="Source Sans Pro" w:eastAsia="Source Sans Pro" w:hAnsi="Source Sans Pro" w:cs="Source Sans Pro"/>
-          <w:b/>
-          <w:sz w:val="19"/>
-          <w:szCs w:val="19"/>
-        </w:rPr>
-        <w:t xml:space="preserve">Automation: </w:t>
-      </w:r>
-      <w:r>
-        <w:rPr>
-          <w:rFonts w:ascii="Source Sans Pro" w:eastAsia="Source Sans Pro" w:hAnsi="Source Sans Pro" w:cs="Source Sans Pro"/>
-          <w:sz w:val="19"/>
-          <w:szCs w:val="19"/>
-        </w:rPr>
-        <w:t>Python, Bash (basic), regular expressions</w:t>
-      </w:r>
-    </w:p>
-    <w:p>
-      <w:pPr>
-        <w:pBdr>
-          <w:bottom w:val="single" w:sz="6" w:space="1" w:color="000000"/>
-        </w:pBdr>
-        <w:spacing w:before="155" w:after="52"/>
-        <w:rPr>
-          <w:rFonts w:ascii="Source Sans Pro" w:eastAsia="Source Sans Pro" w:hAnsi="Source Sans Pro" w:cs="Source Sans Pro"/>
-          <w:b/>
-          <w:bCs/>
-          <w:color w:val="000000"/>
-          <w:sz w:val="22"/>
-          <w:szCs w:val="22"/>
-        </w:rPr>
-      </w:pPr>
-    </w:p>
-    <w:p>
-      <w:pPr>
-        <w:pBdr>
-          <w:bottom w:val="single" w:sz="6" w:space="1" w:color="000000"/>
-        </w:pBdr>
-        <w:spacing w:before="155" w:after="52"/>
-      </w:pPr>
-      <w:r>
-        <w:rPr>
-          <w:rFonts w:ascii="Source Sans Pro" w:eastAsia="Source Sans Pro" w:hAnsi="Source Sans Pro" w:cs="Source Sans Pro"/>
-          <w:b/>
-          <w:bCs/>
-          <w:color w:val="000000"/>
-          <w:sz w:val="22"/>
-          <w:szCs w:val="22"/>
-        </w:rPr>
-        <w:t>Certifications</w:t>
+        <w:spacing w:before="13" w:after="32"/>
+      </w:pPr>
+      <w:r>
+        <w:rPr>
+          <w:rFonts w:ascii="Source Sans Pro" w:eastAsia="Source Sans Pro" w:hAnsi="Source Sans Pro" w:cs="Source Sans Pro"/>
+          <w:color w:val="000000"/>
+          <w:sz w:val="19"/>
+          <w:szCs w:val="19"/>
+        </w:rPr>
+        <w:t>Developed OWASP Top 10 automated web checker to detect web vulnerabilities, including injection, auth, and SSRF; documented SQL injection remediation.</w:t>
       </w:r>
     </w:p>
     <w:p>
@@ -926,16 +805,187 @@
           <w:ilvl w:val="0"/>
           <w:numId w:val="2"/>
         </w:numPr>
-        <w:spacing w:before="13" w:after="13"/>
-      </w:pPr>
-      <w:r>
-        <w:rPr>
-          <w:rFonts w:ascii="Source Sans Pro" w:eastAsia="Source Sans Pro" w:hAnsi="Source Sans Pro" w:cs="Source Sans Pro"/>
-          <w:color w:val="000000"/>
-          <w:sz w:val="19"/>
-          <w:szCs w:val="19"/>
-        </w:rPr>
-        <w:t>CompTIA Security+ SY0-701  —  in progress, exam target Q3 2026</w:t>
+        <w:spacing w:before="13" w:after="32"/>
+      </w:pPr>
+      <w:r>
+        <w:rPr>
+          <w:rFonts w:ascii="Source Sans Pro" w:eastAsia="Source Sans Pro" w:hAnsi="Source Sans Pro" w:cs="Source Sans Pro"/>
+          <w:color w:val="000000"/>
+          <w:sz w:val="19"/>
+          <w:szCs w:val="19"/>
+        </w:rPr>
+        <w:t>Automated scan scheduling via Bash and cron; built delta-scan logic to flag newly discovered CVEs and organize patch compliance (remediation tracking) tracking evidence.</w:t>
+      </w:r>
+    </w:p>
+    <w:p>
+      <w:pPr>
+        <w:pStyle w:val="ListParagraph"/>
+        <w:spacing w:before="23" w:after="23"/>
+        <w:ind w:left="450"/>
+      </w:pPr>
+    </w:p>
+    <w:p>
+      <w:pPr>
+        <w:pBdr>
+          <w:bottom w:val="single" w:sz="6" w:space="1" w:color="000000"/>
+        </w:pBdr>
+        <w:spacing w:before="113" w:after="0"/>
+      </w:pPr>
+      <w:r>
+        <w:rPr>
+          <w:rFonts w:ascii="Source Sans Pro" w:eastAsia="Source Sans Pro" w:hAnsi="Source Sans Pro" w:cs="Source Sans Pro"/>
+          <w:b/>
+          <w:bCs/>
+          <w:color w:val="000000"/>
+          <w:sz w:val="22"/>
+          <w:szCs w:val="22"/>
+        </w:rPr>
+        <w:t>Technical Skills</w:t>
+      </w:r>
+    </w:p>
+    <w:p>
+      <w:pPr>
+        <w:spacing w:before="47" w:after="47"/>
+      </w:pPr>
+      <w:r>
+        <w:rPr>
+          <w:rFonts w:ascii="Source Sans Pro" w:eastAsia="Source Sans Pro" w:hAnsi="Source Sans Pro" w:cs="Source Sans Pro"/>
+          <w:b/>
+          <w:sz w:val="19"/>
+          <w:szCs w:val="19"/>
+        </w:rPr>
+        <w:t xml:space="preserve">SOC Operations: </w:t>
+      </w:r>
+      <w:r>
+        <w:rPr>
+          <w:rFonts w:ascii="Source Sans Pro" w:eastAsia="Source Sans Pro" w:hAnsi="Source Sans Pro" w:cs="Source Sans Pro"/>
+          <w:sz w:val="19"/>
+          <w:szCs w:val="19"/>
+        </w:rPr>
+        <w:t>Alert triage, incident investigation, log analysis, threat detection, escalation, false positive analysis</w:t>
+      </w:r>
+    </w:p>
+    <w:p>
+      <w:pPr>
+        <w:spacing w:before="47" w:after="47"/>
+      </w:pPr>
+      <w:r>
+        <w:rPr>
+          <w:rFonts w:ascii="Source Sans Pro" w:eastAsia="Source Sans Pro" w:hAnsi="Source Sans Pro" w:cs="Source Sans Pro"/>
+          <w:b/>
+          <w:sz w:val="19"/>
+          <w:szCs w:val="19"/>
+        </w:rPr>
+        <w:t xml:space="preserve">SIEM &amp; Monitoring: </w:t>
+      </w:r>
+      <w:r>
+        <w:rPr>
+          <w:rFonts w:ascii="Source Sans Pro" w:eastAsia="Source Sans Pro" w:hAnsi="Source Sans Pro" w:cs="Source Sans Pro"/>
+          <w:sz w:val="19"/>
+          <w:szCs w:val="19"/>
+        </w:rPr>
+        <w:t>Splunk (SPL), Elastic SIEM (basic), Windows Event Logs, Sysmon, Wireshark</w:t>
+      </w:r>
+    </w:p>
+    <w:p>
+      <w:pPr>
+        <w:spacing w:before="47" w:after="47"/>
+      </w:pPr>
+      <w:r>
+        <w:rPr>
+          <w:rFonts w:ascii="Source Sans Pro" w:eastAsia="Source Sans Pro" w:hAnsi="Source Sans Pro" w:cs="Source Sans Pro"/>
+          <w:b/>
+          <w:sz w:val="19"/>
+          <w:szCs w:val="19"/>
+        </w:rPr>
+        <w:t xml:space="preserve">Threat Intelligence: </w:t>
+      </w:r>
+      <w:r>
+        <w:rPr>
+          <w:rFonts w:ascii="Source Sans Pro" w:eastAsia="Source Sans Pro" w:hAnsi="Source Sans Pro" w:cs="Source Sans Pro"/>
+          <w:sz w:val="19"/>
+          <w:szCs w:val="19"/>
+        </w:rPr>
+        <w:t>MITRE ATT&amp;CK, IOC analysis, VirusTotal, OSINT enrichment, Cyber Kill Chain</w:t>
+      </w:r>
+    </w:p>
+    <w:p>
+      <w:pPr>
+        <w:spacing w:before="47" w:after="47"/>
+      </w:pPr>
+      <w:r>
+        <w:rPr>
+          <w:rFonts w:ascii="Source Sans Pro" w:eastAsia="Source Sans Pro" w:hAnsi="Source Sans Pro" w:cs="Source Sans Pro"/>
+          <w:b/>
+          <w:sz w:val="19"/>
+          <w:szCs w:val="19"/>
+        </w:rPr>
+        <w:t xml:space="preserve">Systems &amp; Networking: </w:t>
+      </w:r>
+      <w:r>
+        <w:rPr>
+          <w:rFonts w:ascii="Source Sans Pro" w:eastAsia="Source Sans Pro" w:hAnsi="Source Sans Pro" w:cs="Source Sans Pro"/>
+          <w:sz w:val="19"/>
+          <w:szCs w:val="19"/>
+        </w:rPr>
+        <w:t>Windows internals, Linux fundamentals, TCP/IP, DNS, HTTP/S, firewall and IDS/IPS concepts</w:t>
+      </w:r>
+    </w:p>
+    <w:p>
+      <w:pPr>
+        <w:spacing w:before="47" w:after="36"/>
+      </w:pPr>
+      <w:r>
+        <w:rPr>
+          <w:rFonts w:ascii="Source Sans Pro" w:eastAsia="Source Sans Pro" w:hAnsi="Source Sans Pro" w:cs="Source Sans Pro"/>
+          <w:b/>
+          <w:sz w:val="19"/>
+          <w:szCs w:val="19"/>
+        </w:rPr>
+        <w:t xml:space="preserve">Automation: </w:t>
+      </w:r>
+      <w:r>
+        <w:rPr>
+          <w:rFonts w:ascii="Source Sans Pro" w:eastAsia="Source Sans Pro" w:hAnsi="Source Sans Pro" w:cs="Source Sans Pro"/>
+          <w:sz w:val="19"/>
+          <w:szCs w:val="19"/>
+        </w:rPr>
+        <w:t>Python, Bash (basic), regular expressions</w:t>
+      </w:r>
+    </w:p>
+    <w:p>
+      <w:pPr>
+        <w:pBdr>
+          <w:bottom w:val="single" w:sz="6" w:space="1" w:color="000000"/>
+        </w:pBdr>
+        <w:spacing w:before="23" w:after="23"/>
+        <w:rPr>
+          <w:rFonts w:ascii="Source Sans Pro" w:eastAsia="Source Sans Pro" w:hAnsi="Source Sans Pro" w:cs="Source Sans Pro"/>
+          <w:b/>
+          <w:bCs/>
+          <w:color w:val="000000"/>
+          <w:sz w:val="22"/>
+          <w:szCs w:val="22"/>
+        </w:rPr>
+      </w:pPr>
+    </w:p>
+    <w:p>
+      <w:pPr>
+        <w:pBdr>
+          <w:bottom w:val="single" w:sz="6" w:space="1" w:color="000000"/>
+        </w:pBdr>
+        <w:spacing w:before="113" w:after="0"/>
+      </w:pPr>
+      <w:r>
+        <w:rPr>
+          <w:rFonts w:ascii="Source Sans Pro" w:eastAsia="Source Sans Pro" w:hAnsi="Source Sans Pro" w:cs="Source Sans Pro"/>
+          <w:b/>
+          <w:bCs/>
+          <w:color w:val="000000"/>
+          <w:sz w:val="22"/>
+          <w:szCs w:val="22"/>
+        </w:rPr>
+        <w:t>Certifications</w:t>
       </w:r>
     </w:p>
     <w:p>
@@ -945,7 +995,26 @@
           <w:ilvl w:val="0"/>
           <w:numId w:val="2"/>
         </w:numPr>
-        <w:spacing w:before="13" w:after="13"/>
+        <w:spacing w:before="13" w:after="32"/>
+      </w:pPr>
+      <w:r>
+        <w:rPr>
+          <w:rFonts w:ascii="Source Sans Pro" w:eastAsia="Source Sans Pro" w:hAnsi="Source Sans Pro" w:cs="Source Sans Pro"/>
+          <w:color w:val="000000"/>
+          <w:sz w:val="19"/>
+          <w:szCs w:val="19"/>
+        </w:rPr>
+        <w:t>CompTIA Security+ SY0-701  —  in progress, exam target Q3 2026</w:t>
+      </w:r>
+    </w:p>
+    <w:p>
+      <w:pPr>
+        <w:pStyle w:val="ListParagraph"/>
+        <w:numPr>
+          <w:ilvl w:val="0"/>
+          <w:numId w:val="2"/>
+        </w:numPr>
+        <w:spacing w:before="13" w:after="32"/>
       </w:pPr>
       <w:r>
         <w:rPr>

</xml_diff>